<commit_message>
docs: atualiza documento de visão(v1.2.2)
</commit_message>
<xml_diff>
--- a/docs/visao/visao_parnas.docx
+++ b/docs/visao/visao_parnas.docx
@@ -478,7 +478,7 @@
           <w:szCs w:val="36"/>
           <w:lang w:val="pt-BR"/>
         </w:rPr>
-        <w:t>1</w:t>
+        <w:t>2</w:t>
       </w:r>
     </w:p>
     <w:p>
@@ -3080,6 +3080,149 @@
                 <w:lang w:val="pt-BR"/>
               </w:rPr>
               <w:t>Felipe Melo</w:t>
+            </w:r>
+          </w:p>
+        </w:tc>
+      </w:tr>
+      <w:tr>
+        <w:trPr>
+          <w:trHeight w:val="300"/>
+        </w:trPr>
+        <w:tc>
+          <w:tcPr>
+            <w:tcW w:w="1440" w:type="dxa"/>
+            <w:tcBorders>
+              <w:left w:val="single" w:color="000000" w:themeColor="text1" w:sz="2" w:space="0"/>
+              <w:bottom w:val="single" w:color="000000" w:themeColor="text1" w:sz="2" w:space="0"/>
+            </w:tcBorders>
+            <w:tcMar/>
+          </w:tcPr>
+          <w:p>
+            <w:pPr>
+              <w:pStyle w:val="RUPTabela"/>
+              <w:jc w:val="both"/>
+              <w:rPr>
+                <w:rFonts w:ascii="Times New Roman" w:hAnsi="Times New Roman" w:cs="Times New Roman"/>
+                <w:b w:val="1"/>
+                <w:bCs w:val="1"/>
+                <w:color w:val="000000" w:themeColor="text1" w:themeTint="FF" w:themeShade="FF"/>
+                <w:sz w:val="24"/>
+                <w:szCs w:val="24"/>
+                <w:lang w:val="pt-BR"/>
+              </w:rPr>
+            </w:pPr>
+            <w:r>
+              <w:rPr>
+                <w:rFonts w:ascii="Times New Roman" w:hAnsi="Times New Roman" w:cs="Times New Roman"/>
+                <w:b w:val="1"/>
+                <w:bCs w:val="1"/>
+                <w:color w:val="000000" w:themeColor="text1" w:themeTint="FF" w:themeShade="FF"/>
+                <w:sz w:val="24"/>
+                <w:szCs w:val="24"/>
+                <w:lang w:val="pt-BR"/>
+              </w:rPr>
+              <w:t>08/06/2026</w:t>
+            </w:r>
+          </w:p>
+        </w:tc>
+        <w:tc>
+          <w:tcPr>
+            <w:tcW w:w="840" w:type="dxa"/>
+            <w:tcBorders>
+              <w:left w:val="single" w:color="000000" w:themeColor="text1" w:sz="2" w:space="0"/>
+              <w:bottom w:val="single" w:color="000000" w:themeColor="text1" w:sz="2" w:space="0"/>
+            </w:tcBorders>
+            <w:tcMar/>
+          </w:tcPr>
+          <w:p>
+            <w:pPr>
+              <w:pStyle w:val="RUPTabela"/>
+              <w:jc w:val="both"/>
+              <w:rPr>
+                <w:rFonts w:ascii="Times New Roman" w:hAnsi="Times New Roman" w:cs="Times New Roman"/>
+                <w:color w:val="000000" w:themeColor="text1" w:themeTint="FF" w:themeShade="FF"/>
+                <w:sz w:val="24"/>
+                <w:szCs w:val="24"/>
+                <w:lang w:val="pt-BR"/>
+              </w:rPr>
+            </w:pPr>
+            <w:r>
+              <w:rPr>
+                <w:rFonts w:ascii="Times New Roman" w:hAnsi="Times New Roman" w:cs="Times New Roman"/>
+                <w:color w:val="000000" w:themeColor="text1" w:themeTint="FF" w:themeShade="FF"/>
+                <w:sz w:val="24"/>
+                <w:szCs w:val="24"/>
+                <w:lang w:val="pt-BR"/>
+              </w:rPr>
+              <w:t>1.2.2</w:t>
+            </w:r>
+          </w:p>
+        </w:tc>
+        <w:tc>
+          <w:tcPr>
+            <w:tcW w:w="4036" w:type="dxa"/>
+            <w:tcBorders>
+              <w:left w:val="single" w:color="000000" w:themeColor="text1" w:sz="2" w:space="0"/>
+              <w:bottom w:val="single" w:color="000000" w:themeColor="text1" w:sz="2" w:space="0"/>
+            </w:tcBorders>
+            <w:tcMar/>
+          </w:tcPr>
+          <w:p>
+            <w:pPr>
+              <w:pStyle w:val="RUPTabela"/>
+              <w:spacing w:line="259" w:lineRule="auto"/>
+              <w:jc w:val="both"/>
+              <w:rPr>
+                <w:rFonts w:ascii="Times New Roman" w:hAnsi="Times New Roman" w:cs="Times New Roman"/>
+                <w:color w:val="000000" w:themeColor="text1" w:themeTint="FF" w:themeShade="FF"/>
+                <w:sz w:val="24"/>
+                <w:szCs w:val="24"/>
+                <w:lang w:val="pt-BR"/>
+              </w:rPr>
+            </w:pPr>
+            <w:r>
+              <w:rPr>
+                <w:rFonts w:ascii="Times New Roman" w:hAnsi="Times New Roman" w:cs="Times New Roman"/>
+                <w:color w:val="000000" w:themeColor="text1" w:themeTint="FF" w:themeShade="FF"/>
+                <w:sz w:val="24"/>
+                <w:szCs w:val="24"/>
+                <w:lang w:val="pt-BR"/>
+              </w:rPr>
+              <w:t>Atualização nas funções</w:t>
+            </w:r>
+          </w:p>
+        </w:tc>
+        <w:tc>
+          <w:tcPr>
+            <w:tcW w:w="2713" w:type="dxa"/>
+            <w:tcBorders>
+              <w:left w:val="single" w:color="000000" w:themeColor="text1" w:sz="2" w:space="0"/>
+              <w:bottom w:val="single" w:color="000000" w:themeColor="text1" w:sz="2" w:space="0"/>
+              <w:right w:val="single" w:color="000000" w:themeColor="text1" w:sz="2" w:space="0"/>
+            </w:tcBorders>
+            <w:tcMar/>
+          </w:tcPr>
+          <w:p>
+            <w:pPr>
+              <w:pStyle w:val="RUPTabela"/>
+              <w:jc w:val="both"/>
+              <w:rPr>
+                <w:rFonts w:ascii="Times New Roman" w:hAnsi="Times New Roman" w:cs="Times New Roman"/>
+                <w:color w:val="000000" w:themeColor="text1" w:themeTint="FF" w:themeShade="FF"/>
+                <w:sz w:val="24"/>
+                <w:szCs w:val="24"/>
+                <w:lang w:val="pt-BR"/>
+              </w:rPr>
+            </w:pPr>
+            <w:r>
+              <w:rPr>
+                <w:rFonts w:ascii="Times New Roman" w:hAnsi="Times New Roman" w:cs="Times New Roman"/>
+                <w:color w:val="000000" w:themeColor="text1" w:themeTint="FF" w:themeShade="FF"/>
+                <w:sz w:val="24"/>
+                <w:szCs w:val="24"/>
+                <w:lang w:val="pt-BR"/>
+              </w:rPr>
+              <w:t>Felipe Melo, Arthur Mariani</w:t>
             </w:r>
           </w:p>
         </w:tc>
@@ -9640,6 +9783,17 @@
               </w:rPr>
               <w:t xml:space="preserve"> Nápoles</w:t>
             </w:r>
+            <w:r>
+              <w:rPr>
+                <w:rFonts w:ascii="Times New Roman" w:hAnsi="Times New Roman" w:eastAsia="Times New Roman" w:cs="Times New Roman"/>
+                <w:i w:val="0"/>
+                <w:iCs w:val="0"/>
+                <w:color w:val="000000" w:themeColor="text1" w:themeTint="FF" w:themeShade="FF"/>
+                <w:sz w:val="24"/>
+                <w:szCs w:val="24"/>
+              </w:rPr>
+              <w:t>, Arthur Coelho</w:t>
+            </w:r>
           </w:p>
         </w:tc>
       </w:tr>
@@ -9675,51 +9829,7 @@
                 <w:sz w:val="24"/>
                 <w:szCs w:val="24"/>
               </w:rPr>
-              <w:t xml:space="preserve">Desenvolvedores </w:t>
-            </w:r>
-            <w:r>
-              <w:rPr>
-                <w:rFonts w:ascii="Times New Roman" w:hAnsi="Times New Roman" w:eastAsia="Times New Roman" w:cs="Times New Roman"/>
-                <w:i w:val="0"/>
-                <w:iCs w:val="0"/>
-                <w:color w:val="000000" w:themeColor="text1" w:themeTint="FF" w:themeShade="FF"/>
-                <w:sz w:val="24"/>
-                <w:szCs w:val="24"/>
-              </w:rPr>
-              <w:t>f</w:t>
-            </w:r>
-            <w:r>
-              <w:rPr>
-                <w:rFonts w:ascii="Times New Roman" w:hAnsi="Times New Roman" w:eastAsia="Times New Roman" w:cs="Times New Roman"/>
-                <w:i w:val="0"/>
-                <w:iCs w:val="0"/>
-                <w:color w:val="000000" w:themeColor="text1" w:themeTint="FF" w:themeShade="FF"/>
-                <w:sz w:val="24"/>
-                <w:szCs w:val="24"/>
-              </w:rPr>
-              <w:t>ront-</w:t>
-            </w:r>
-            <w:r>
-              <w:rPr>
-                <w:rFonts w:ascii="Times New Roman" w:hAnsi="Times New Roman" w:eastAsia="Times New Roman" w:cs="Times New Roman"/>
-                <w:i w:val="0"/>
-                <w:iCs w:val="0"/>
-                <w:color w:val="000000" w:themeColor="text1" w:themeTint="FF" w:themeShade="FF"/>
-                <w:sz w:val="24"/>
-                <w:szCs w:val="24"/>
-              </w:rPr>
-              <w:t>end</w:t>
-            </w:r>
-            <w:r>
-              <w:rPr>
-                <w:rFonts w:ascii="Times New Roman" w:hAnsi="Times New Roman" w:eastAsia="Times New Roman" w:cs="Times New Roman"/>
-                <w:i w:val="0"/>
-                <w:iCs w:val="0"/>
-                <w:color w:val="000000" w:themeColor="text1" w:themeTint="FF" w:themeShade="FF"/>
-                <w:sz w:val="24"/>
-                <w:szCs w:val="24"/>
-              </w:rPr>
-              <w:t xml:space="preserve"> (Integração)</w:t>
+              <w:t>Analistas de qualidade</w:t>
             </w:r>
           </w:p>
         </w:tc>
@@ -9759,7 +9869,7 @@
                 <w:szCs w:val="24"/>
                 <w:lang w:val="pt-BR"/>
               </w:rPr>
-              <w:t>Implementação da interface visual, consumo de APIs, integração com o back-end, garantia de responsividade.</w:t>
+              <w:t>Execução de testes manuais e automatizados, identificação de bugs, validação de requisitos, garantia da estabilidade.</w:t>
             </w:r>
           </w:p>
         </w:tc>
@@ -9772,7 +9882,10 @@
           <w:p>
             <w:pPr>
               <w:pStyle w:val="Instruo"/>
-              <w:spacing w:line="259" w:lineRule="auto"/>
+              <w:suppressLineNumbers w:val="0"/>
+              <w:bidi w:val="0"/>
+              <w:spacing w:before="0" w:beforeAutospacing="off" w:after="0" w:afterAutospacing="off" w:line="259" w:lineRule="auto"/>
+              <w:ind w:left="0" w:right="0"/>
               <w:jc w:val="center"/>
               <w:rPr>
                 <w:rFonts w:ascii="Times New Roman" w:hAnsi="Times New Roman" w:eastAsia="Times New Roman" w:cs="Times New Roman"/>
@@ -9792,29 +9905,18 @@
                 <w:sz w:val="24"/>
                 <w:szCs w:val="24"/>
               </w:rPr>
-              <w:t>Arthur</w:t>
-            </w:r>
-            <w:r>
-              <w:rPr>
-                <w:rFonts w:ascii="Times New Roman" w:hAnsi="Times New Roman" w:eastAsia="Times New Roman" w:cs="Times New Roman"/>
-                <w:i w:val="0"/>
-                <w:iCs w:val="0"/>
-                <w:color w:val="000000" w:themeColor="text1" w:themeTint="FF" w:themeShade="FF"/>
-                <w:sz w:val="24"/>
-                <w:szCs w:val="24"/>
-              </w:rPr>
-              <w:t xml:space="preserve"> </w:t>
-            </w:r>
-            <w:r>
-              <w:rPr>
-                <w:rFonts w:ascii="Times New Roman" w:hAnsi="Times New Roman" w:eastAsia="Times New Roman" w:cs="Times New Roman"/>
-                <w:i w:val="0"/>
-                <w:iCs w:val="0"/>
-                <w:color w:val="000000" w:themeColor="text1" w:themeTint="FF" w:themeShade="FF"/>
-                <w:sz w:val="24"/>
-                <w:szCs w:val="24"/>
-              </w:rPr>
-              <w:t>Coelho</w:t>
+              <w:t>Rodrigo</w:t>
+            </w:r>
+            <w:r>
+              <w:rPr>
+                <w:rFonts w:ascii="Times New Roman" w:hAnsi="Times New Roman" w:eastAsia="Times New Roman" w:cs="Times New Roman"/>
+                <w:i w:val="0"/>
+                <w:iCs w:val="0"/>
+                <w:color w:val="000000" w:themeColor="text1" w:themeTint="FF" w:themeShade="FF"/>
+                <w:sz w:val="24"/>
+                <w:szCs w:val="24"/>
+              </w:rPr>
+              <w:t xml:space="preserve"> Barbosa</w:t>
             </w:r>
           </w:p>
         </w:tc>
@@ -9846,7 +9948,18 @@
                 <w:sz w:val="24"/>
                 <w:szCs w:val="24"/>
               </w:rPr>
-              <w:t>Arthur Coelho, Rodrigo</w:t>
+              <w:t>Daniel Ribeiro</w:t>
+            </w:r>
+            <w:r>
+              <w:rPr>
+                <w:rFonts w:ascii="Times New Roman" w:hAnsi="Times New Roman" w:eastAsia="Times New Roman" w:cs="Times New Roman"/>
+                <w:i w:val="0"/>
+                <w:iCs w:val="0"/>
+                <w:color w:val="000000" w:themeColor="text1" w:themeTint="FF" w:themeShade="FF"/>
+                <w:sz w:val="24"/>
+                <w:szCs w:val="24"/>
+              </w:rPr>
+              <w:t>, Rodrigo</w:t>
             </w:r>
             <w:r>
               <w:rPr>
@@ -9894,7 +10007,197 @@
                 <w:sz w:val="24"/>
                 <w:szCs w:val="24"/>
               </w:rPr>
-              <w:t>Analistas de qualidade</w:t>
+              <w:t>Analistas de requisitos e documentação</w:t>
+            </w:r>
+          </w:p>
+        </w:tc>
+        <w:tc>
+          <w:tcPr>
+            <w:tcW w:w="4046" w:type="dxa"/>
+            <w:tcMar/>
+            <w:vAlign w:val="center"/>
+          </w:tcPr>
+          <w:p>
+            <w:pPr>
+              <w:pStyle w:val="Instruo"/>
+              <w:suppressLineNumbers w:val="0"/>
+              <w:bidi w:val="0"/>
+              <w:spacing w:before="0" w:beforeAutospacing="off" w:after="0" w:afterAutospacing="off" w:line="259" w:lineRule="auto"/>
+              <w:ind w:left="0" w:right="0"/>
+              <w:jc w:val="center"/>
+              <w:rPr>
+                <w:rFonts w:ascii="Times New Roman" w:hAnsi="Times New Roman" w:eastAsia="Times New Roman" w:cs="Times New Roman"/>
+                <w:i w:val="0"/>
+                <w:iCs w:val="0"/>
+                <w:noProof w:val="0"/>
+                <w:color w:val="000000" w:themeColor="text1" w:themeTint="FF" w:themeShade="FF"/>
+                <w:sz w:val="24"/>
+                <w:szCs w:val="24"/>
+                <w:lang w:val="pt-BR"/>
+              </w:rPr>
+            </w:pPr>
+            <w:r>
+              <w:rPr>
+                <w:rFonts w:ascii="Times New Roman" w:hAnsi="Times New Roman" w:eastAsia="Times New Roman" w:cs="Times New Roman"/>
+                <w:i w:val="0"/>
+                <w:iCs w:val="0"/>
+                <w:noProof w:val="0"/>
+                <w:color w:val="000000" w:themeColor="text1" w:themeTint="FF" w:themeShade="FF"/>
+                <w:sz w:val="24"/>
+                <w:szCs w:val="24"/>
+                <w:lang w:val="pt-BR"/>
+              </w:rPr>
+              <w:t>Levantamento de necessidades, escrita de especificações técnicas, criação de manuais, mapeamento de processos.</w:t>
+            </w:r>
+          </w:p>
+        </w:tc>
+        <w:tc>
+          <w:tcPr>
+            <w:tcW w:w="1580" w:type="dxa"/>
+            <w:tcMar/>
+            <w:vAlign w:val="center"/>
+          </w:tcPr>
+          <w:p>
+            <w:pPr>
+              <w:pStyle w:val="Instruo"/>
+              <w:spacing w:line="259" w:lineRule="auto"/>
+              <w:jc w:val="center"/>
+              <w:rPr>
+                <w:rFonts w:ascii="Times New Roman" w:hAnsi="Times New Roman" w:eastAsia="Times New Roman" w:cs="Times New Roman"/>
+                <w:i w:val="0"/>
+                <w:iCs w:val="0"/>
+                <w:color w:val="000000" w:themeColor="text1" w:themeTint="FF" w:themeShade="FF"/>
+                <w:sz w:val="24"/>
+                <w:szCs w:val="24"/>
+              </w:rPr>
+            </w:pPr>
+            <w:r>
+              <w:rPr>
+                <w:rFonts w:ascii="Times New Roman" w:hAnsi="Times New Roman" w:eastAsia="Times New Roman" w:cs="Times New Roman"/>
+                <w:i w:val="0"/>
+                <w:iCs w:val="0"/>
+                <w:color w:val="000000" w:themeColor="text1" w:themeTint="FF" w:themeShade="FF"/>
+                <w:sz w:val="24"/>
+                <w:szCs w:val="24"/>
+              </w:rPr>
+              <w:t>Guilherme</w:t>
+            </w:r>
+            <w:r>
+              <w:rPr>
+                <w:rFonts w:ascii="Times New Roman" w:hAnsi="Times New Roman" w:eastAsia="Times New Roman" w:cs="Times New Roman"/>
+                <w:i w:val="0"/>
+                <w:iCs w:val="0"/>
+                <w:color w:val="000000" w:themeColor="text1" w:themeTint="FF" w:themeShade="FF"/>
+                <w:sz w:val="24"/>
+                <w:szCs w:val="24"/>
+              </w:rPr>
+              <w:t xml:space="preserve"> Souza</w:t>
+            </w:r>
+          </w:p>
+        </w:tc>
+        <w:tc>
+          <w:tcPr>
+            <w:tcW w:w="1680" w:type="dxa"/>
+            <w:tcMar/>
+            <w:vAlign w:val="center"/>
+          </w:tcPr>
+          <w:p>
+            <w:pPr>
+              <w:pStyle w:val="Normal"/>
+              <w:suppressLineNumbers w:val="0"/>
+              <w:bidi w:val="0"/>
+              <w:spacing w:before="0" w:beforeAutospacing="off" w:after="0" w:afterAutospacing="off" w:line="259" w:lineRule="auto"/>
+              <w:ind w:left="0" w:right="0"/>
+              <w:jc w:val="center"/>
+              <w:rPr>
+                <w:rFonts w:ascii="Times New Roman" w:hAnsi="Times New Roman" w:eastAsia="Times New Roman" w:cs="Times New Roman"/>
+                <w:i w:val="0"/>
+                <w:iCs w:val="0"/>
+                <w:color w:val="000000" w:themeColor="text1" w:themeTint="FF" w:themeShade="FF"/>
+                <w:sz w:val="24"/>
+                <w:szCs w:val="24"/>
+              </w:rPr>
+            </w:pPr>
+            <w:r>
+              <w:rPr>
+                <w:rFonts w:ascii="Times New Roman" w:hAnsi="Times New Roman" w:eastAsia="Times New Roman" w:cs="Times New Roman"/>
+                <w:i w:val="0"/>
+                <w:iCs w:val="0"/>
+                <w:color w:val="000000" w:themeColor="text1" w:themeTint="FF" w:themeShade="FF"/>
+                <w:sz w:val="24"/>
+                <w:szCs w:val="24"/>
+              </w:rPr>
+              <w:t>Guilherme</w:t>
+            </w:r>
+            <w:r>
+              <w:rPr>
+                <w:rFonts w:ascii="Times New Roman" w:hAnsi="Times New Roman" w:eastAsia="Times New Roman" w:cs="Times New Roman"/>
+                <w:i w:val="0"/>
+                <w:iCs w:val="0"/>
+                <w:color w:val="000000" w:themeColor="text1" w:themeTint="FF" w:themeShade="FF"/>
+                <w:sz w:val="24"/>
+                <w:szCs w:val="24"/>
+              </w:rPr>
+              <w:t xml:space="preserve"> Souza</w:t>
+            </w:r>
+            <w:r>
+              <w:rPr>
+                <w:rFonts w:ascii="Times New Roman" w:hAnsi="Times New Roman" w:eastAsia="Times New Roman" w:cs="Times New Roman"/>
+                <w:i w:val="0"/>
+                <w:iCs w:val="0"/>
+                <w:color w:val="000000" w:themeColor="text1" w:themeTint="FF" w:themeShade="FF"/>
+                <w:sz w:val="24"/>
+                <w:szCs w:val="24"/>
+              </w:rPr>
+              <w:t>, Rodrigo Barbosa</w:t>
+            </w:r>
+            <w:r>
+              <w:rPr>
+                <w:rFonts w:ascii="Times New Roman" w:hAnsi="Times New Roman" w:eastAsia="Times New Roman" w:cs="Times New Roman"/>
+                <w:i w:val="0"/>
+                <w:iCs w:val="0"/>
+                <w:color w:val="000000" w:themeColor="text1" w:themeTint="FF" w:themeShade="FF"/>
+                <w:sz w:val="24"/>
+                <w:szCs w:val="24"/>
+              </w:rPr>
+              <w:t>, Arthur Mariani</w:t>
+            </w:r>
+          </w:p>
+        </w:tc>
+      </w:tr>
+      <w:tr>
+        <w:trPr>
+          <w:trHeight w:val="300"/>
+        </w:trPr>
+        <w:tc>
+          <w:tcPr>
+            <w:tcW w:w="1903" w:type="dxa"/>
+            <w:tcMar/>
+            <w:vAlign w:val="center"/>
+          </w:tcPr>
+          <w:p>
+            <w:pPr>
+              <w:pStyle w:val="Instruo"/>
+              <w:jc w:val="center"/>
+              <w:rPr>
+                <w:rFonts w:ascii="Times New Roman" w:hAnsi="Times New Roman" w:eastAsia="Times New Roman" w:cs="Times New Roman"/>
+                <w:i w:val="0"/>
+                <w:iCs w:val="0"/>
+                <w:color w:val="000000" w:themeColor="text1" w:themeTint="FF" w:themeShade="FF"/>
+                <w:sz w:val="24"/>
+                <w:szCs w:val="24"/>
+              </w:rPr>
+            </w:pPr>
+            <w:r>
+              <w:rPr>
+                <w:rFonts w:ascii="Times New Roman" w:hAnsi="Times New Roman" w:eastAsia="Times New Roman" w:cs="Times New Roman"/>
+                <w:i w:val="0"/>
+                <w:iCs w:val="0"/>
+                <w:color w:val="000000" w:themeColor="text1" w:themeTint="FF" w:themeShade="FF"/>
+                <w:sz w:val="24"/>
+                <w:szCs w:val="24"/>
+              </w:rPr>
+              <w:t>Engenheiro de Dados</w:t>
             </w:r>
           </w:p>
         </w:tc>
@@ -9934,7 +10237,7 @@
                 <w:szCs w:val="24"/>
                 <w:lang w:val="pt-BR"/>
               </w:rPr>
-              <w:t>Execução de testes manuais e automatizados, identificação de bugs, validação de requisitos, garantia da estabilidade.</w:t>
+              <w:t>Modelagem de dados, criação de pipelines (ETL), integração de fontes de dados, otimização de consultas.</w:t>
             </w:r>
           </w:p>
         </w:tc>
@@ -9970,18 +10273,7 @@
                 <w:sz w:val="24"/>
                 <w:szCs w:val="24"/>
               </w:rPr>
-              <w:t>Rodrigo</w:t>
-            </w:r>
-            <w:r>
-              <w:rPr>
-                <w:rFonts w:ascii="Times New Roman" w:hAnsi="Times New Roman" w:eastAsia="Times New Roman" w:cs="Times New Roman"/>
-                <w:i w:val="0"/>
-                <w:iCs w:val="0"/>
-                <w:color w:val="000000" w:themeColor="text1" w:themeTint="FF" w:themeShade="FF"/>
-                <w:sz w:val="24"/>
-                <w:szCs w:val="24"/>
-              </w:rPr>
-              <w:t xml:space="preserve"> Barbosa</w:t>
+              <w:t>Pietro Ritchele</w:t>
             </w:r>
           </w:p>
         </w:tc>
@@ -10013,18 +10305,18 @@
                 <w:sz w:val="24"/>
                 <w:szCs w:val="24"/>
               </w:rPr>
-              <w:t>Arthur Mariani, Rodrigo</w:t>
-            </w:r>
-            <w:r>
-              <w:rPr>
-                <w:rFonts w:ascii="Times New Roman" w:hAnsi="Times New Roman" w:eastAsia="Times New Roman" w:cs="Times New Roman"/>
-                <w:i w:val="0"/>
-                <w:iCs w:val="0"/>
-                <w:color w:val="000000" w:themeColor="text1" w:themeTint="FF" w:themeShade="FF"/>
-                <w:sz w:val="24"/>
-                <w:szCs w:val="24"/>
-              </w:rPr>
-              <w:t xml:space="preserve"> Barbosa</w:t>
+              <w:t>Carlos, Daniel Ribeiro</w:t>
+            </w:r>
+            <w:r>
+              <w:rPr>
+                <w:rFonts w:ascii="Times New Roman" w:hAnsi="Times New Roman" w:eastAsia="Times New Roman" w:cs="Times New Roman"/>
+                <w:i w:val="0"/>
+                <w:iCs w:val="0"/>
+                <w:color w:val="000000" w:themeColor="text1" w:themeTint="FF" w:themeShade="FF"/>
+                <w:sz w:val="24"/>
+                <w:szCs w:val="24"/>
+              </w:rPr>
+              <w:t>, Pietro</w:t>
             </w:r>
           </w:p>
         </w:tc>
@@ -10061,7 +10353,7 @@
                 <w:sz w:val="24"/>
                 <w:szCs w:val="24"/>
               </w:rPr>
-              <w:t>Analistas de requisitos e documentação</w:t>
+              <w:t>Cliente</w:t>
             </w:r>
           </w:p>
         </w:tc>
@@ -10074,34 +10366,37 @@
           <w:p>
             <w:pPr>
               <w:pStyle w:val="Instruo"/>
-              <w:suppressLineNumbers w:val="0"/>
-              <w:bidi w:val="0"/>
-              <w:spacing w:before="0" w:beforeAutospacing="off" w:after="0" w:afterAutospacing="off" w:line="259" w:lineRule="auto"/>
-              <w:ind w:left="0" w:right="0"/>
               <w:jc w:val="both"/>
               <w:rPr>
                 <w:rFonts w:ascii="Times New Roman" w:hAnsi="Times New Roman" w:eastAsia="Times New Roman" w:cs="Times New Roman"/>
                 <w:i w:val="0"/>
                 <w:iCs w:val="0"/>
-                <w:noProof w:val="0"/>
-                <w:color w:val="000000" w:themeColor="text1" w:themeTint="FF" w:themeShade="FF"/>
-                <w:sz w:val="24"/>
-                <w:szCs w:val="24"/>
-                <w:lang w:val="pt-BR"/>
-              </w:rPr>
-            </w:pPr>
-            <w:r>
-              <w:rPr>
-                <w:rFonts w:ascii="Times New Roman" w:hAnsi="Times New Roman" w:eastAsia="Times New Roman" w:cs="Times New Roman"/>
-                <w:i w:val="0"/>
-                <w:iCs w:val="0"/>
-                <w:noProof w:val="0"/>
-                <w:color w:val="000000" w:themeColor="text1" w:themeTint="FF" w:themeShade="FF"/>
-                <w:sz w:val="24"/>
-                <w:szCs w:val="24"/>
-                <w:lang w:val="pt-BR"/>
-              </w:rPr>
-              <w:t>Levantamento de necessidades, escrita de especificações técnicas, criação de manuais, mapeamento de processos.</w:t>
+                <w:color w:val="000000" w:themeColor="text1" w:themeTint="FF" w:themeShade="FF"/>
+                <w:sz w:val="24"/>
+                <w:szCs w:val="24"/>
+              </w:rPr>
+            </w:pPr>
+            <w:r>
+              <w:rPr>
+                <w:rFonts w:ascii="Times New Roman" w:hAnsi="Times New Roman" w:eastAsia="Times New Roman" w:cs="Times New Roman"/>
+                <w:i w:val="0"/>
+                <w:iCs w:val="0"/>
+                <w:color w:val="000000" w:themeColor="text1" w:themeTint="FF" w:themeShade="FF"/>
+                <w:sz w:val="24"/>
+                <w:szCs w:val="24"/>
+              </w:rPr>
+              <w:t>Validar requisitos e entregas, fornecer feedback sobre o sistema, representar as necessidades</w:t>
+            </w:r>
+            <w:r>
+              <w:rPr>
+                <w:rFonts w:ascii="Times New Roman" w:hAnsi="Times New Roman" w:eastAsia="Times New Roman" w:cs="Times New Roman"/>
+                <w:i w:val="0"/>
+                <w:iCs w:val="0"/>
+                <w:color w:val="000000" w:themeColor="text1" w:themeTint="FF" w:themeShade="FF"/>
+                <w:sz w:val="24"/>
+                <w:szCs w:val="24"/>
+              </w:rPr>
+              <w:t>.</w:t>
             </w:r>
           </w:p>
         </w:tc>
@@ -10109,7 +10404,7 @@
           <w:tcPr>
             <w:tcW w:w="1580" w:type="dxa"/>
             <w:tcMar/>
-            <w:vAlign w:val="center"/>
+            <w:vAlign w:val="top"/>
           </w:tcPr>
           <w:p>
             <w:pPr>
@@ -10134,343 +10429,9 @@
                 <w:sz w:val="24"/>
                 <w:szCs w:val="24"/>
               </w:rPr>
-              <w:t>Guilherme</w:t>
-            </w:r>
-            <w:r>
-              <w:rPr>
-                <w:rFonts w:ascii="Times New Roman" w:hAnsi="Times New Roman" w:eastAsia="Times New Roman" w:cs="Times New Roman"/>
-                <w:i w:val="0"/>
-                <w:iCs w:val="0"/>
-                <w:color w:val="000000" w:themeColor="text1" w:themeTint="FF" w:themeShade="FF"/>
-                <w:sz w:val="24"/>
-                <w:szCs w:val="24"/>
-              </w:rPr>
-              <w:t xml:space="preserve"> Souza</w:t>
-            </w:r>
-          </w:p>
-        </w:tc>
-        <w:tc>
-          <w:tcPr>
-            <w:tcW w:w="1680" w:type="dxa"/>
-            <w:tcMar/>
-            <w:vAlign w:val="center"/>
-          </w:tcPr>
-          <w:p>
-            <w:pPr>
-              <w:pStyle w:val="Normal"/>
-              <w:suppressLineNumbers w:val="0"/>
-              <w:bidi w:val="0"/>
-              <w:spacing w:before="0" w:beforeAutospacing="off" w:after="0" w:afterAutospacing="off" w:line="259" w:lineRule="auto"/>
-              <w:ind w:left="0" w:right="0"/>
-              <w:jc w:val="center"/>
-              <w:rPr>
-                <w:rFonts w:ascii="Times New Roman" w:hAnsi="Times New Roman" w:eastAsia="Times New Roman" w:cs="Times New Roman"/>
-                <w:i w:val="0"/>
-                <w:iCs w:val="0"/>
-                <w:color w:val="000000" w:themeColor="text1" w:themeTint="FF" w:themeShade="FF"/>
-                <w:sz w:val="24"/>
-                <w:szCs w:val="24"/>
-              </w:rPr>
-            </w:pPr>
-            <w:r>
-              <w:rPr>
-                <w:rFonts w:ascii="Times New Roman" w:hAnsi="Times New Roman" w:eastAsia="Times New Roman" w:cs="Times New Roman"/>
-                <w:i w:val="0"/>
-                <w:iCs w:val="0"/>
-                <w:color w:val="000000" w:themeColor="text1" w:themeTint="FF" w:themeShade="FF"/>
-                <w:sz w:val="24"/>
-                <w:szCs w:val="24"/>
-              </w:rPr>
-              <w:t xml:space="preserve">Daniel </w:t>
-            </w:r>
-            <w:r>
-              <w:rPr>
-                <w:rFonts w:ascii="Times New Roman" w:hAnsi="Times New Roman" w:eastAsia="Times New Roman" w:cs="Times New Roman"/>
-                <w:i w:val="0"/>
-                <w:iCs w:val="0"/>
-                <w:color w:val="000000" w:themeColor="text1" w:themeTint="FF" w:themeShade="FF"/>
-                <w:sz w:val="24"/>
-                <w:szCs w:val="24"/>
-              </w:rPr>
-              <w:t>Ribeiro</w:t>
-            </w:r>
-            <w:r>
-              <w:rPr>
-                <w:rFonts w:ascii="Times New Roman" w:hAnsi="Times New Roman" w:eastAsia="Times New Roman" w:cs="Times New Roman"/>
-                <w:i w:val="0"/>
-                <w:iCs w:val="0"/>
-                <w:color w:val="000000" w:themeColor="text1" w:themeTint="FF" w:themeShade="FF"/>
-                <w:sz w:val="24"/>
-                <w:szCs w:val="24"/>
-              </w:rPr>
-              <w:t xml:space="preserve">, </w:t>
-            </w:r>
-            <w:r>
-              <w:rPr>
-                <w:rFonts w:ascii="Times New Roman" w:hAnsi="Times New Roman" w:eastAsia="Times New Roman" w:cs="Times New Roman"/>
-                <w:i w:val="0"/>
-                <w:iCs w:val="0"/>
-                <w:color w:val="000000" w:themeColor="text1" w:themeTint="FF" w:themeShade="FF"/>
-                <w:sz w:val="24"/>
-                <w:szCs w:val="24"/>
-              </w:rPr>
-              <w:t>Guilherme</w:t>
-            </w:r>
-            <w:r>
-              <w:rPr>
-                <w:rFonts w:ascii="Times New Roman" w:hAnsi="Times New Roman" w:eastAsia="Times New Roman" w:cs="Times New Roman"/>
-                <w:i w:val="0"/>
-                <w:iCs w:val="0"/>
-                <w:color w:val="000000" w:themeColor="text1" w:themeTint="FF" w:themeShade="FF"/>
-                <w:sz w:val="24"/>
-                <w:szCs w:val="24"/>
-              </w:rPr>
-              <w:t xml:space="preserve"> Souza</w:t>
-            </w:r>
-          </w:p>
-        </w:tc>
-      </w:tr>
-      <w:tr>
-        <w:trPr>
-          <w:trHeight w:val="300"/>
-        </w:trPr>
-        <w:tc>
-          <w:tcPr>
-            <w:tcW w:w="1903" w:type="dxa"/>
-            <w:tcMar/>
-            <w:vAlign w:val="center"/>
-          </w:tcPr>
-          <w:p>
-            <w:pPr>
-              <w:pStyle w:val="Instruo"/>
-              <w:jc w:val="center"/>
-              <w:rPr>
-                <w:rFonts w:ascii="Times New Roman" w:hAnsi="Times New Roman" w:eastAsia="Times New Roman" w:cs="Times New Roman"/>
-                <w:i w:val="0"/>
-                <w:iCs w:val="0"/>
-                <w:color w:val="000000" w:themeColor="text1" w:themeTint="FF" w:themeShade="FF"/>
-                <w:sz w:val="24"/>
-                <w:szCs w:val="24"/>
-              </w:rPr>
-            </w:pPr>
-            <w:r>
-              <w:rPr>
-                <w:rFonts w:ascii="Times New Roman" w:hAnsi="Times New Roman" w:eastAsia="Times New Roman" w:cs="Times New Roman"/>
-                <w:i w:val="0"/>
-                <w:iCs w:val="0"/>
-                <w:color w:val="000000" w:themeColor="text1" w:themeTint="FF" w:themeShade="FF"/>
-                <w:sz w:val="24"/>
-                <w:szCs w:val="24"/>
-              </w:rPr>
-              <w:t>Engenheiro de Dados</w:t>
-            </w:r>
-          </w:p>
-        </w:tc>
-        <w:tc>
-          <w:tcPr>
-            <w:tcW w:w="4046" w:type="dxa"/>
-            <w:tcMar/>
-            <w:vAlign w:val="top"/>
-          </w:tcPr>
-          <w:p>
-            <w:pPr>
-              <w:pStyle w:val="Instruo"/>
-              <w:suppressLineNumbers w:val="0"/>
-              <w:bidi w:val="0"/>
-              <w:spacing w:before="0" w:beforeAutospacing="off" w:after="0" w:afterAutospacing="off" w:line="259" w:lineRule="auto"/>
-              <w:ind w:left="0" w:right="0"/>
-              <w:jc w:val="both"/>
-              <w:rPr>
-                <w:rFonts w:ascii="Times New Roman" w:hAnsi="Times New Roman" w:eastAsia="Times New Roman" w:cs="Times New Roman"/>
-                <w:i w:val="0"/>
-                <w:iCs w:val="0"/>
-                <w:noProof w:val="0"/>
-                <w:color w:val="000000" w:themeColor="text1" w:themeTint="FF" w:themeShade="FF"/>
-                <w:sz w:val="24"/>
-                <w:szCs w:val="24"/>
-                <w:lang w:val="pt-BR"/>
-              </w:rPr>
-            </w:pPr>
-            <w:r>
-              <w:rPr>
-                <w:rFonts w:ascii="Times New Roman" w:hAnsi="Times New Roman" w:eastAsia="Times New Roman" w:cs="Times New Roman"/>
-                <w:i w:val="0"/>
-                <w:iCs w:val="0"/>
-                <w:noProof w:val="0"/>
-                <w:color w:val="000000" w:themeColor="text1" w:themeTint="FF" w:themeShade="FF"/>
-                <w:sz w:val="24"/>
-                <w:szCs w:val="24"/>
-                <w:lang w:val="pt-BR"/>
-              </w:rPr>
-              <w:t>Modelagem de dados, criação de pipelines (ETL), integração de fontes de dados, otimização de consultas.</w:t>
-            </w:r>
-          </w:p>
-        </w:tc>
-        <w:tc>
-          <w:tcPr>
-            <w:tcW w:w="1580" w:type="dxa"/>
-            <w:tcMar/>
-            <w:vAlign w:val="center"/>
-          </w:tcPr>
-          <w:p>
-            <w:pPr>
-              <w:pStyle w:val="Instruo"/>
-              <w:suppressLineNumbers w:val="0"/>
-              <w:bidi w:val="0"/>
-              <w:spacing w:before="0" w:beforeAutospacing="off" w:after="0" w:afterAutospacing="off" w:line="259" w:lineRule="auto"/>
-              <w:ind w:left="0" w:right="0"/>
-              <w:jc w:val="center"/>
-              <w:rPr>
-                <w:rFonts w:ascii="Times New Roman" w:hAnsi="Times New Roman" w:eastAsia="Times New Roman" w:cs="Times New Roman"/>
-                <w:i w:val="0"/>
-                <w:iCs w:val="0"/>
-                <w:color w:val="000000" w:themeColor="text1" w:themeTint="FF" w:themeShade="FF"/>
-                <w:sz w:val="24"/>
-                <w:szCs w:val="24"/>
-              </w:rPr>
-            </w:pPr>
-            <w:r>
-              <w:rPr>
-                <w:rFonts w:ascii="Times New Roman" w:hAnsi="Times New Roman" w:eastAsia="Times New Roman" w:cs="Times New Roman"/>
-                <w:i w:val="0"/>
-                <w:iCs w:val="0"/>
-                <w:color w:val="000000" w:themeColor="text1" w:themeTint="FF" w:themeShade="FF"/>
-                <w:sz w:val="24"/>
-                <w:szCs w:val="24"/>
-              </w:rPr>
-              <w:t>Pietro Ritchele</w:t>
-            </w:r>
-          </w:p>
-        </w:tc>
-        <w:tc>
-          <w:tcPr>
-            <w:tcW w:w="1680" w:type="dxa"/>
-            <w:tcMar/>
-            <w:vAlign w:val="center"/>
-          </w:tcPr>
-          <w:p>
-            <w:pPr>
-              <w:pStyle w:val="Normal"/>
-              <w:jc w:val="center"/>
-              <w:rPr>
-                <w:rFonts w:ascii="Times New Roman" w:hAnsi="Times New Roman" w:eastAsia="Times New Roman" w:cs="Times New Roman"/>
-                <w:i w:val="0"/>
-                <w:iCs w:val="0"/>
-                <w:color w:val="000000" w:themeColor="text1" w:themeTint="FF" w:themeShade="FF"/>
-                <w:sz w:val="24"/>
-                <w:szCs w:val="24"/>
-              </w:rPr>
-            </w:pPr>
-            <w:r>
-              <w:rPr>
-                <w:rFonts w:ascii="Times New Roman" w:hAnsi="Times New Roman" w:eastAsia="Times New Roman" w:cs="Times New Roman"/>
-                <w:i w:val="0"/>
-                <w:iCs w:val="0"/>
-                <w:color w:val="000000" w:themeColor="text1" w:themeTint="FF" w:themeShade="FF"/>
-                <w:sz w:val="24"/>
-                <w:szCs w:val="24"/>
-              </w:rPr>
-              <w:t>Carlos, Daniel Ribeiro</w:t>
-            </w:r>
-            <w:r>
-              <w:rPr>
-                <w:rFonts w:ascii="Times New Roman" w:hAnsi="Times New Roman" w:eastAsia="Times New Roman" w:cs="Times New Roman"/>
-                <w:i w:val="0"/>
-                <w:iCs w:val="0"/>
-                <w:color w:val="000000" w:themeColor="text1" w:themeTint="FF" w:themeShade="FF"/>
-                <w:sz w:val="24"/>
-                <w:szCs w:val="24"/>
-              </w:rPr>
-              <w:t>, Pietro</w:t>
-            </w:r>
-          </w:p>
-        </w:tc>
-      </w:tr>
-      <w:tr>
-        <w:trPr>
-          <w:trHeight w:val="300"/>
-        </w:trPr>
-        <w:tc>
-          <w:tcPr>
-            <w:tcW w:w="1903" w:type="dxa"/>
-            <w:tcMar/>
-            <w:vAlign w:val="center"/>
-          </w:tcPr>
-          <w:p>
-            <w:pPr>
-              <w:pStyle w:val="Instruo"/>
-              <w:jc w:val="center"/>
-              <w:rPr>
-                <w:rFonts w:ascii="Times New Roman" w:hAnsi="Times New Roman" w:eastAsia="Times New Roman" w:cs="Times New Roman"/>
-                <w:i w:val="0"/>
-                <w:iCs w:val="0"/>
-                <w:color w:val="000000" w:themeColor="text1" w:themeTint="FF" w:themeShade="FF"/>
-                <w:sz w:val="24"/>
-                <w:szCs w:val="24"/>
-              </w:rPr>
-            </w:pPr>
-            <w:r>
-              <w:rPr>
-                <w:rFonts w:ascii="Times New Roman" w:hAnsi="Times New Roman" w:eastAsia="Times New Roman" w:cs="Times New Roman"/>
-                <w:i w:val="0"/>
-                <w:iCs w:val="0"/>
-                <w:color w:val="000000" w:themeColor="text1" w:themeTint="FF" w:themeShade="FF"/>
-                <w:sz w:val="24"/>
-                <w:szCs w:val="24"/>
-              </w:rPr>
-              <w:t>Cliente</w:t>
-            </w:r>
-          </w:p>
-        </w:tc>
-        <w:tc>
-          <w:tcPr>
-            <w:tcW w:w="4046" w:type="dxa"/>
-            <w:tcMar/>
-            <w:vAlign w:val="top"/>
-          </w:tcPr>
-          <w:p>
-            <w:pPr>
-              <w:pStyle w:val="Instruo"/>
-              <w:jc w:val="both"/>
-              <w:rPr>
-                <w:rFonts w:ascii="Times New Roman" w:hAnsi="Times New Roman" w:eastAsia="Times New Roman" w:cs="Times New Roman"/>
-                <w:i w:val="0"/>
-                <w:iCs w:val="0"/>
-                <w:color w:val="000000" w:themeColor="text1" w:themeTint="FF" w:themeShade="FF"/>
-                <w:sz w:val="24"/>
-                <w:szCs w:val="24"/>
-              </w:rPr>
-            </w:pPr>
-            <w:r>
-              <w:rPr>
-                <w:rFonts w:ascii="Times New Roman" w:hAnsi="Times New Roman" w:eastAsia="Times New Roman" w:cs="Times New Roman"/>
-                <w:i w:val="0"/>
-                <w:iCs w:val="0"/>
-                <w:color w:val="000000" w:themeColor="text1" w:themeTint="FF" w:themeShade="FF"/>
-                <w:sz w:val="24"/>
-                <w:szCs w:val="24"/>
-              </w:rPr>
-              <w:t>Validar requisitos e entregas, fornecer feedback sobre o sistema, representar as necessidades</w:t>
-            </w:r>
-            <w:r>
-              <w:rPr>
-                <w:rFonts w:ascii="Times New Roman" w:hAnsi="Times New Roman" w:eastAsia="Times New Roman" w:cs="Times New Roman"/>
-                <w:i w:val="0"/>
-                <w:iCs w:val="0"/>
-                <w:color w:val="000000" w:themeColor="text1" w:themeTint="FF" w:themeShade="FF"/>
-                <w:sz w:val="24"/>
-                <w:szCs w:val="24"/>
-              </w:rPr>
-              <w:t>.</w:t>
-            </w:r>
-          </w:p>
-        </w:tc>
-        <w:tc>
-          <w:tcPr>
-            <w:tcW w:w="1580" w:type="dxa"/>
-            <w:tcMar/>
-            <w:vAlign w:val="top"/>
-          </w:tcPr>
+              <w:t>Daniel</w:t>
+            </w:r>
+          </w:p>
           <w:p>
             <w:pPr>
               <w:pStyle w:val="Instruo"/>
@@ -10494,32 +10455,6 @@
                 <w:sz w:val="24"/>
                 <w:szCs w:val="24"/>
               </w:rPr>
-              <w:t>Daniel</w:t>
-            </w:r>
-          </w:p>
-          <w:p>
-            <w:pPr>
-              <w:pStyle w:val="Instruo"/>
-              <w:spacing w:line="259" w:lineRule="auto"/>
-              <w:jc w:val="center"/>
-              <w:rPr>
-                <w:rFonts w:ascii="Times New Roman" w:hAnsi="Times New Roman" w:eastAsia="Times New Roman" w:cs="Times New Roman"/>
-                <w:i w:val="0"/>
-                <w:iCs w:val="0"/>
-                <w:color w:val="000000" w:themeColor="text1" w:themeTint="FF" w:themeShade="FF"/>
-                <w:sz w:val="24"/>
-                <w:szCs w:val="24"/>
-              </w:rPr>
-            </w:pPr>
-            <w:r>
-              <w:rPr>
-                <w:rFonts w:ascii="Times New Roman" w:hAnsi="Times New Roman" w:eastAsia="Times New Roman" w:cs="Times New Roman"/>
-                <w:i w:val="0"/>
-                <w:iCs w:val="0"/>
-                <w:color w:val="000000" w:themeColor="text1" w:themeTint="FF" w:themeShade="FF"/>
-                <w:sz w:val="24"/>
-                <w:szCs w:val="24"/>
-              </w:rPr>
               <w:t>Ribeiro</w:t>
             </w:r>
           </w:p>
@@ -10528,7 +10463,7 @@
           <w:tcPr>
             <w:tcW w:w="1680" w:type="dxa"/>
             <w:tcMar/>
-            <w:vAlign w:val="top"/>
+            <w:vAlign w:val="center"/>
           </w:tcPr>
           <w:p>
             <w:pPr>
@@ -10552,7 +10487,7 @@
                 <w:sz w:val="24"/>
                 <w:szCs w:val="24"/>
               </w:rPr>
-              <w:t>Daniel Ribeiro, Charles Ruan</w:t>
+              <w:t>Daniel Ribeiro</w:t>
             </w:r>
           </w:p>
         </w:tc>
@@ -10673,8 +10608,8 @@
       </w:tblPr>
       <w:tblGrid>
         <w:gridCol w:w="1102"/>
-        <w:gridCol w:w="1432"/>
-        <w:gridCol w:w="1344"/>
+        <w:gridCol w:w="1400"/>
+        <w:gridCol w:w="1376"/>
         <w:gridCol w:w="1320"/>
         <w:gridCol w:w="1504"/>
         <w:gridCol w:w="1770"/>
@@ -10720,7 +10655,7 @@
         </w:tc>
         <w:tc>
           <w:tcPr>
-            <w:tcW w:w="1432" w:type="dxa"/>
+            <w:tcW w:w="1400" w:type="dxa"/>
             <w:tcMar/>
             <w:vAlign w:val="center"/>
           </w:tcPr>
@@ -10757,7 +10692,7 @@
         </w:tc>
         <w:tc>
           <w:tcPr>
-            <w:tcW w:w="1344" w:type="dxa"/>
+            <w:tcW w:w="1376" w:type="dxa"/>
             <w:tcMar/>
             <w:vAlign w:val="center"/>
           </w:tcPr>
@@ -10996,7 +10931,7 @@
         </w:tc>
         <w:tc>
           <w:tcPr>
-            <w:tcW w:w="1432" w:type="dxa"/>
+            <w:tcW w:w="1400" w:type="dxa"/>
             <w:tcMar/>
             <w:vAlign w:val="center"/>
           </w:tcPr>
@@ -11032,7 +10967,7 @@
         </w:tc>
         <w:tc>
           <w:tcPr>
-            <w:tcW w:w="1344" w:type="dxa"/>
+            <w:tcW w:w="1376" w:type="dxa"/>
             <w:tcMar/>
             <w:vAlign w:val="center"/>
           </w:tcPr>
@@ -11253,7 +11188,7 @@
         </w:tc>
         <w:tc>
           <w:tcPr>
-            <w:tcW w:w="1432" w:type="dxa"/>
+            <w:tcW w:w="1400" w:type="dxa"/>
             <w:tcMar/>
             <w:vAlign w:val="center"/>
           </w:tcPr>
@@ -11298,7 +11233,7 @@
         </w:tc>
         <w:tc>
           <w:tcPr>
-            <w:tcW w:w="1344" w:type="dxa"/>
+            <w:tcW w:w="1376" w:type="dxa"/>
             <w:tcMar/>
             <w:vAlign w:val="center"/>
           </w:tcPr>
@@ -11541,7 +11476,7 @@
         </w:tc>
         <w:tc>
           <w:tcPr>
-            <w:tcW w:w="1432" w:type="dxa"/>
+            <w:tcW w:w="1400" w:type="dxa"/>
             <w:tcMar/>
             <w:vAlign w:val="center"/>
           </w:tcPr>
@@ -11589,7 +11524,7 @@
         </w:tc>
         <w:tc>
           <w:tcPr>
-            <w:tcW w:w="1344" w:type="dxa"/>
+            <w:tcW w:w="1376" w:type="dxa"/>
             <w:tcMar/>
             <w:vAlign w:val="center"/>
           </w:tcPr>
@@ -11844,7 +11779,7 @@
         </w:tc>
         <w:tc>
           <w:tcPr>
-            <w:tcW w:w="1432" w:type="dxa"/>
+            <w:tcW w:w="1400" w:type="dxa"/>
             <w:tcMar/>
             <w:vAlign w:val="center"/>
           </w:tcPr>
@@ -11879,7 +11814,7 @@
         </w:tc>
         <w:tc>
           <w:tcPr>
-            <w:tcW w:w="1344" w:type="dxa"/>
+            <w:tcW w:w="1376" w:type="dxa"/>
             <w:tcMar/>
             <w:vAlign w:val="center"/>
           </w:tcPr>
@@ -12041,7 +11976,51 @@
                 <w:sz w:val="24"/>
                 <w:szCs w:val="24"/>
               </w:rPr>
-              <w:t>Desenvolvedores Backend, Desenvolvedores Frontend (Integração), Analista de Qualidade</w:t>
+              <w:t xml:space="preserve">Desenvolvedores </w:t>
+            </w:r>
+            <w:r>
+              <w:rPr>
+                <w:rFonts w:ascii="Times New Roman" w:hAnsi="Times New Roman" w:eastAsia="Times New Roman" w:cs="Times New Roman"/>
+                <w:i w:val="0"/>
+                <w:iCs w:val="0"/>
+                <w:color w:val="auto"/>
+                <w:sz w:val="24"/>
+                <w:szCs w:val="24"/>
+              </w:rPr>
+              <w:t>Backend</w:t>
+            </w:r>
+            <w:r>
+              <w:rPr>
+                <w:rFonts w:ascii="Times New Roman" w:hAnsi="Times New Roman" w:eastAsia="Times New Roman" w:cs="Times New Roman"/>
+                <w:i w:val="0"/>
+                <w:iCs w:val="0"/>
+                <w:color w:val="auto"/>
+                <w:sz w:val="24"/>
+                <w:szCs w:val="24"/>
+              </w:rPr>
+              <w:t xml:space="preserve">, Desenvolvedores </w:t>
+            </w:r>
+            <w:r>
+              <w:rPr>
+                <w:rFonts w:ascii="Times New Roman" w:hAnsi="Times New Roman" w:eastAsia="Times New Roman" w:cs="Times New Roman"/>
+                <w:i w:val="0"/>
+                <w:iCs w:val="0"/>
+                <w:color w:val="auto"/>
+                <w:sz w:val="24"/>
+                <w:szCs w:val="24"/>
+              </w:rPr>
+              <w:t>Frontend</w:t>
+            </w:r>
+            <w:r>
+              <w:rPr>
+                <w:rFonts w:ascii="Times New Roman" w:hAnsi="Times New Roman" w:eastAsia="Times New Roman" w:cs="Times New Roman"/>
+                <w:i w:val="0"/>
+                <w:iCs w:val="0"/>
+                <w:color w:val="auto"/>
+                <w:sz w:val="24"/>
+                <w:szCs w:val="24"/>
+              </w:rPr>
+              <w:t>, Analista de Qualidade</w:t>
             </w:r>
           </w:p>
         </w:tc>
@@ -12118,7 +12097,7 @@
         </w:tc>
         <w:tc>
           <w:tcPr>
-            <w:tcW w:w="1432" w:type="dxa"/>
+            <w:tcW w:w="1400" w:type="dxa"/>
             <w:tcMar/>
             <w:vAlign w:val="center"/>
           </w:tcPr>
@@ -12192,7 +12171,7 @@
         </w:tc>
         <w:tc>
           <w:tcPr>
-            <w:tcW w:w="1344" w:type="dxa"/>
+            <w:tcW w:w="1376" w:type="dxa"/>
             <w:tcMar/>
             <w:vAlign w:val="center"/>
           </w:tcPr>
@@ -12362,7 +12341,7 @@
                 <w:sz w:val="24"/>
                 <w:szCs w:val="24"/>
               </w:rPr>
-              <w:t xml:space="preserve"> (Integração), Analista de Qualidade</w:t>
+              <w:t>, Analista de Qualidade</w:t>
             </w:r>
           </w:p>
         </w:tc>
@@ -12395,7 +12374,286 @@
                 <w:sz w:val="24"/>
                 <w:szCs w:val="24"/>
               </w:rPr>
-              <w:t>5%</w:t>
+              <w:t>100</w:t>
+            </w:r>
+            <w:r>
+              <w:rPr>
+                <w:rFonts w:ascii="Times New Roman" w:hAnsi="Times New Roman" w:eastAsia="Times New Roman" w:cs="Times New Roman"/>
+                <w:i w:val="0"/>
+                <w:iCs w:val="0"/>
+                <w:color w:val="000000" w:themeColor="text1" w:themeTint="FF" w:themeShade="FF"/>
+                <w:sz w:val="24"/>
+                <w:szCs w:val="24"/>
+              </w:rPr>
+              <w:t>%</w:t>
+            </w:r>
+          </w:p>
+        </w:tc>
+      </w:tr>
+      <w:tr>
+        <w:trPr>
+          <w:trHeight w:val="300"/>
+        </w:trPr>
+        <w:tc>
+          <w:tcPr>
+            <w:tcW w:w="1102" w:type="dxa"/>
+            <w:tcMar/>
+            <w:vAlign w:val="center"/>
+          </w:tcPr>
+          <w:p>
+            <w:pPr>
+              <w:pStyle w:val="Instruo"/>
+              <w:spacing w:line="276" w:lineRule="auto"/>
+              <w:jc w:val="center"/>
+              <w:rPr>
+                <w:rFonts w:ascii="Times New Roman" w:hAnsi="Times New Roman" w:eastAsia="Times New Roman" w:cs="Times New Roman"/>
+                <w:i w:val="0"/>
+                <w:iCs w:val="0"/>
+                <w:color w:val="000000" w:themeColor="text1" w:themeTint="FF" w:themeShade="FF"/>
+                <w:sz w:val="24"/>
+                <w:szCs w:val="24"/>
+              </w:rPr>
+            </w:pPr>
+            <w:r>
+              <w:rPr>
+                <w:rFonts w:ascii="Times New Roman" w:hAnsi="Times New Roman" w:eastAsia="Times New Roman" w:cs="Times New Roman"/>
+                <w:i w:val="0"/>
+                <w:iCs w:val="0"/>
+                <w:color w:val="000000" w:themeColor="text1" w:themeTint="FF" w:themeShade="FF"/>
+                <w:sz w:val="24"/>
+                <w:szCs w:val="24"/>
+              </w:rPr>
+              <w:t>Sprint 5</w:t>
+            </w:r>
+          </w:p>
+        </w:tc>
+        <w:tc>
+          <w:tcPr>
+            <w:tcW w:w="1400" w:type="dxa"/>
+            <w:tcMar/>
+            <w:vAlign w:val="center"/>
+          </w:tcPr>
+          <w:p>
+            <w:pPr>
+              <w:pStyle w:val="Normal"/>
+              <w:jc w:val="center"/>
+              <w:rPr>
+                <w:rFonts w:ascii="Times New Roman" w:hAnsi="Times New Roman" w:eastAsia="Times New Roman" w:cs="Times New Roman"/>
+                <w:noProof w:val="0"/>
+                <w:lang w:val="pt-BR"/>
+              </w:rPr>
+            </w:pPr>
+            <w:r>
+              <w:rPr>
+                <w:rFonts w:ascii="Times New Roman" w:hAnsi="Times New Roman" w:eastAsia="Times New Roman" w:cs="Times New Roman"/>
+                <w:noProof w:val="0"/>
+                <w:lang w:val="pt-BR"/>
+              </w:rPr>
+              <w:t>Refinamento do MVP, segurança e padronização.</w:t>
+            </w:r>
+          </w:p>
+        </w:tc>
+        <w:tc>
+          <w:tcPr>
+            <w:tcW w:w="1376" w:type="dxa"/>
+            <w:tcMar/>
+            <w:vAlign w:val="center"/>
+          </w:tcPr>
+          <w:p>
+            <w:pPr>
+              <w:pStyle w:val="Instruo"/>
+              <w:spacing w:line="276" w:lineRule="auto"/>
+              <w:jc w:val="center"/>
+              <w:rPr>
+                <w:rFonts w:ascii="Times New Roman" w:hAnsi="Times New Roman" w:eastAsia="Times New Roman" w:cs="Times New Roman"/>
+                <w:i w:val="0"/>
+                <w:iCs w:val="0"/>
+                <w:color w:val="000000" w:themeColor="text1" w:themeTint="FF" w:themeShade="FF"/>
+                <w:sz w:val="24"/>
+                <w:szCs w:val="24"/>
+              </w:rPr>
+            </w:pPr>
+            <w:r>
+              <w:rPr>
+                <w:rFonts w:ascii="Times New Roman" w:hAnsi="Times New Roman" w:eastAsia="Times New Roman" w:cs="Times New Roman"/>
+                <w:i w:val="0"/>
+                <w:iCs w:val="0"/>
+                <w:color w:val="000000" w:themeColor="text1" w:themeTint="FF" w:themeShade="FF"/>
+                <w:sz w:val="24"/>
+                <w:szCs w:val="24"/>
+              </w:rPr>
+              <w:t>08/06/2026</w:t>
+            </w:r>
+          </w:p>
+        </w:tc>
+        <w:tc>
+          <w:tcPr>
+            <w:tcW w:w="1320" w:type="dxa"/>
+            <w:tcMar/>
+            <w:vAlign w:val="center"/>
+          </w:tcPr>
+          <w:p>
+            <w:pPr>
+              <w:pStyle w:val="Instruo"/>
+              <w:spacing w:line="276" w:lineRule="auto"/>
+              <w:jc w:val="center"/>
+              <w:rPr>
+                <w:rFonts w:ascii="Times New Roman" w:hAnsi="Times New Roman" w:eastAsia="Times New Roman" w:cs="Times New Roman"/>
+                <w:i w:val="0"/>
+                <w:iCs w:val="0"/>
+                <w:color w:val="000000" w:themeColor="text1" w:themeTint="FF" w:themeShade="FF"/>
+                <w:sz w:val="24"/>
+                <w:szCs w:val="24"/>
+              </w:rPr>
+            </w:pPr>
+            <w:r>
+              <w:rPr>
+                <w:rFonts w:ascii="Times New Roman" w:hAnsi="Times New Roman" w:eastAsia="Times New Roman" w:cs="Times New Roman"/>
+                <w:i w:val="0"/>
+                <w:iCs w:val="0"/>
+                <w:color w:val="000000" w:themeColor="text1" w:themeTint="FF" w:themeShade="FF"/>
+                <w:sz w:val="24"/>
+                <w:szCs w:val="24"/>
+              </w:rPr>
+              <w:t>15/06/2026</w:t>
+            </w:r>
+          </w:p>
+        </w:tc>
+        <w:tc>
+          <w:tcPr>
+            <w:tcW w:w="1504" w:type="dxa"/>
+            <w:tcMar/>
+            <w:vAlign w:val="center"/>
+          </w:tcPr>
+          <w:p>
+            <w:pPr>
+              <w:pStyle w:val="Normal"/>
+              <w:suppressLineNumbers w:val="0"/>
+              <w:bidi w:val="0"/>
+              <w:spacing w:before="0" w:beforeAutospacing="off" w:after="0" w:afterAutospacing="off" w:line="276" w:lineRule="auto"/>
+              <w:ind w:left="0" w:right="0"/>
+              <w:jc w:val="center"/>
+            </w:pPr>
+            <w:r>
+              <w:rPr>
+                <w:rFonts w:ascii="Times New Roman" w:hAnsi="Times New Roman" w:eastAsia="Times New Roman" w:cs="Times New Roman"/>
+                <w:i w:val="0"/>
+                <w:iCs w:val="0"/>
+                <w:color w:val="000000" w:themeColor="text1" w:themeTint="FF" w:themeShade="FF"/>
+                <w:sz w:val="24"/>
+                <w:szCs w:val="24"/>
+              </w:rPr>
+              <w:t>Versão beta (v1.0.0)</w:t>
+            </w:r>
+          </w:p>
+        </w:tc>
+        <w:tc>
+          <w:tcPr>
+            <w:tcW w:w="1770" w:type="dxa"/>
+            <w:tcMar/>
+            <w:vAlign w:val="center"/>
+          </w:tcPr>
+          <w:p>
+            <w:pPr>
+              <w:pStyle w:val="CTMISInstrues"/>
+              <w:spacing w:line="276" w:lineRule="auto"/>
+              <w:jc w:val="center"/>
+              <w:rPr>
+                <w:rFonts w:ascii="Times New Roman" w:hAnsi="Times New Roman" w:eastAsia="Times New Roman" w:cs="Times New Roman"/>
+                <w:i w:val="0"/>
+                <w:iCs w:val="0"/>
+                <w:color w:val="auto"/>
+                <w:sz w:val="24"/>
+                <w:szCs w:val="24"/>
+              </w:rPr>
+            </w:pPr>
+            <w:r>
+              <w:rPr>
+                <w:rFonts w:ascii="Times New Roman" w:hAnsi="Times New Roman" w:eastAsia="Times New Roman" w:cs="Times New Roman"/>
+                <w:i w:val="0"/>
+                <w:iCs w:val="0"/>
+                <w:color w:val="auto"/>
+                <w:sz w:val="24"/>
+                <w:szCs w:val="24"/>
+              </w:rPr>
+              <w:t xml:space="preserve">Desenvolvedores </w:t>
+            </w:r>
+            <w:r>
+              <w:rPr>
+                <w:rFonts w:ascii="Times New Roman" w:hAnsi="Times New Roman" w:eastAsia="Times New Roman" w:cs="Times New Roman"/>
+                <w:i w:val="0"/>
+                <w:iCs w:val="0"/>
+                <w:color w:val="auto"/>
+                <w:sz w:val="24"/>
+                <w:szCs w:val="24"/>
+              </w:rPr>
+              <w:t>Backend</w:t>
+            </w:r>
+            <w:r>
+              <w:rPr>
+                <w:rFonts w:ascii="Times New Roman" w:hAnsi="Times New Roman" w:eastAsia="Times New Roman" w:cs="Times New Roman"/>
+                <w:i w:val="0"/>
+                <w:iCs w:val="0"/>
+                <w:color w:val="auto"/>
+                <w:sz w:val="24"/>
+                <w:szCs w:val="24"/>
+              </w:rPr>
+              <w:t xml:space="preserve">, Desenvolvedores </w:t>
+            </w:r>
+            <w:r>
+              <w:rPr>
+                <w:rFonts w:ascii="Times New Roman" w:hAnsi="Times New Roman" w:eastAsia="Times New Roman" w:cs="Times New Roman"/>
+                <w:i w:val="0"/>
+                <w:iCs w:val="0"/>
+                <w:color w:val="auto"/>
+                <w:sz w:val="24"/>
+                <w:szCs w:val="24"/>
+              </w:rPr>
+              <w:t>Frontend</w:t>
+            </w:r>
+            <w:r>
+              <w:rPr>
+                <w:rFonts w:ascii="Times New Roman" w:hAnsi="Times New Roman" w:eastAsia="Times New Roman" w:cs="Times New Roman"/>
+                <w:i w:val="0"/>
+                <w:iCs w:val="0"/>
+                <w:color w:val="auto"/>
+                <w:sz w:val="24"/>
+                <w:szCs w:val="24"/>
+              </w:rPr>
+              <w:t>, Engenheiro de dados, Analista de Qualidade</w:t>
+            </w:r>
+          </w:p>
+        </w:tc>
+        <w:tc>
+          <w:tcPr>
+            <w:tcW w:w="1243" w:type="dxa"/>
+            <w:tcMar/>
+            <w:vAlign w:val="center"/>
+          </w:tcPr>
+          <w:p>
+            <w:pPr>
+              <w:pStyle w:val="Instruo"/>
+              <w:spacing w:line="276" w:lineRule="auto"/>
+              <w:jc w:val="center"/>
+              <w:rPr>
+                <w:rFonts w:ascii="Times New Roman" w:hAnsi="Times New Roman" w:eastAsia="Times New Roman" w:cs="Times New Roman"/>
+                <w:i w:val="0"/>
+                <w:iCs w:val="0"/>
+                <w:color w:val="000000" w:themeColor="text1" w:themeTint="FF" w:themeShade="FF"/>
+                <w:sz w:val="24"/>
+                <w:szCs w:val="24"/>
+              </w:rPr>
+            </w:pPr>
+            <w:r>
+              <w:rPr>
+                <w:rFonts w:ascii="Times New Roman" w:hAnsi="Times New Roman" w:eastAsia="Times New Roman" w:cs="Times New Roman"/>
+                <w:i w:val="0"/>
+                <w:iCs w:val="0"/>
+                <w:color w:val="000000" w:themeColor="text1" w:themeTint="FF" w:themeShade="FF"/>
+                <w:sz w:val="24"/>
+                <w:szCs w:val="24"/>
+              </w:rPr>
+              <w:t>0%</w:t>
             </w:r>
           </w:p>
         </w:tc>
@@ -13305,6 +13563,7 @@
           <w:p>
             <w:pPr>
               <w:pStyle w:val="Normal"/>
+              <w:jc w:val="center"/>
               <w:rPr>
                 <w:rFonts w:ascii="Times New Roman" w:hAnsi="Times New Roman" w:eastAsia="Times New Roman" w:cs="Times New Roman"/>
                 <w:b w:val="0"/>

</xml_diff>